<commit_message>
DMESUPPORT-223  updated doc document
</commit_message>
<xml_diff>
--- a/docs/Design/DME Workflow Tar Contetns file framework Changes Design Document.docx
+++ b/docs/Design/DME Workflow Tar Contetns file framework Changes Design Document.docx
@@ -3626,7 +3626,100 @@
           <w:sz w:val="21"/>
           <w:szCs w:val="21"/>
         </w:rPr>
-        <w:t>Normalize paths and sort entries deterministically.</w:t>
+        <w:t xml:space="preserve">For </w:t>
+      </w:r>
+      <w:r>
+        <w:rPr>
+          <w:rFonts w:ascii="Segoe UI" w:hAnsi="Segoe UI" w:cs="Segoe UI"/>
+          <w:color w:val="1F2328"/>
+          <w:sz w:val="21"/>
+          <w:szCs w:val="21"/>
+        </w:rPr>
+        <w:t>Broken</w:t>
+      </w:r>
+      <w:r>
+        <w:rPr>
+          <w:rFonts w:ascii="Segoe UI" w:hAnsi="Segoe UI" w:cs="Segoe UI"/>
+          <w:color w:val="1F2328"/>
+          <w:sz w:val="21"/>
+          <w:szCs w:val="21"/>
+        </w:rPr>
+        <w:t xml:space="preserve"> symlinks, record:</w:t>
+      </w:r>
+    </w:p>
+    <w:p>
+      <w:pPr>
+        <w:numPr>
+          <w:ilvl w:val="1"/>
+          <w:numId w:val="21"/>
+        </w:numPr>
+        <w:shd w:val="clear" w:color="auto" w:fill="FFFFFF"/>
+        <w:spacing w:before="100" w:beforeAutospacing="1" w:after="100" w:afterAutospacing="1"/>
+        <w:rPr>
+          <w:rFonts w:ascii="Segoe UI" w:hAnsi="Segoe UI" w:cs="Segoe UI"/>
+          <w:color w:val="1F2328"/>
+          <w:sz w:val="21"/>
+          <w:szCs w:val="21"/>
+        </w:rPr>
+      </w:pPr>
+      <w:r>
+        <w:rPr>
+          <w:rFonts w:ascii="Segoe UI" w:hAnsi="Segoe UI" w:cs="Segoe UI"/>
+          <w:color w:val="1F2328"/>
+          <w:sz w:val="21"/>
+          <w:szCs w:val="21"/>
+        </w:rPr>
+        <w:t>relative path,</w:t>
+      </w:r>
+    </w:p>
+    <w:p>
+      <w:pPr>
+        <w:numPr>
+          <w:ilvl w:val="1"/>
+          <w:numId w:val="21"/>
+        </w:numPr>
+        <w:shd w:val="clear" w:color="auto" w:fill="FFFFFF"/>
+        <w:spacing w:before="60" w:after="100" w:afterAutospacing="1"/>
+        <w:rPr>
+          <w:rFonts w:ascii="Segoe UI" w:hAnsi="Segoe UI" w:cs="Segoe UI"/>
+          <w:color w:val="1F2328"/>
+          <w:sz w:val="21"/>
+          <w:szCs w:val="21"/>
+        </w:rPr>
+      </w:pPr>
+      <w:r>
+        <w:rPr>
+          <w:rFonts w:ascii="Segoe UI" w:hAnsi="Segoe UI" w:cs="Segoe UI"/>
+          <w:color w:val="1F2328"/>
+          <w:sz w:val="21"/>
+          <w:szCs w:val="21"/>
+        </w:rPr>
+        <w:t>type,</w:t>
+      </w:r>
+    </w:p>
+    <w:p>
+      <w:pPr>
+        <w:numPr>
+          <w:ilvl w:val="1"/>
+          <w:numId w:val="21"/>
+        </w:numPr>
+        <w:shd w:val="clear" w:color="auto" w:fill="FFFFFF"/>
+        <w:spacing w:before="60" w:after="100" w:afterAutospacing="1"/>
+        <w:rPr>
+          <w:rFonts w:ascii="Segoe UI" w:hAnsi="Segoe UI" w:cs="Segoe UI"/>
+          <w:color w:val="1F2328"/>
+          <w:sz w:val="21"/>
+          <w:szCs w:val="21"/>
+        </w:rPr>
+      </w:pPr>
+      <w:r>
+        <w:rPr>
+          <w:rFonts w:ascii="Segoe UI" w:hAnsi="Segoe UI" w:cs="Segoe UI"/>
+          <w:color w:val="1F2328"/>
+          <w:sz w:val="21"/>
+          <w:szCs w:val="21"/>
+        </w:rPr>
+        <w:t>relevant metadata such as symlink target.</w:t>
       </w:r>
     </w:p>
     <w:p>
@@ -3651,7 +3744,7 @@
           <w:sz w:val="21"/>
           <w:szCs w:val="21"/>
         </w:rPr>
-        <w:t>Compute a checksum of the manifest itself.</w:t>
+        <w:t>Normalize paths and sort entries deterministically.</w:t>
       </w:r>
     </w:p>
     <w:p>
@@ -3676,7 +3769,7 @@
           <w:sz w:val="21"/>
           <w:szCs w:val="21"/>
         </w:rPr>
-        <w:t>Store the manifest and manifest checksum separately from the tar archive.</w:t>
+        <w:t>Compute a checksum of the manifest itself.</w:t>
       </w:r>
     </w:p>
     <w:p>
@@ -3701,25 +3794,7 @@
           <w:sz w:val="21"/>
           <w:szCs w:val="21"/>
         </w:rPr>
-        <w:t xml:space="preserve">Create and upload the tar archive </w:t>
-      </w:r>
-      <w:r>
-        <w:rPr>
-          <w:rFonts w:ascii="Segoe UI" w:hAnsi="Segoe UI" w:cs="Segoe UI"/>
-          <w:color w:val="1F2328"/>
-          <w:sz w:val="21"/>
-          <w:szCs w:val="21"/>
-        </w:rPr>
-        <w:t xml:space="preserve">, tar contents files </w:t>
-      </w:r>
-      <w:r>
-        <w:rPr>
-          <w:rFonts w:ascii="Segoe UI" w:hAnsi="Segoe UI" w:cs="Segoe UI"/>
-          <w:color w:val="1F2328"/>
-          <w:sz w:val="21"/>
-          <w:szCs w:val="21"/>
-        </w:rPr>
-        <w:t>as usual.</w:t>
+        <w:t>Store the manifest and manifest checksum separately from the tar archive.</w:t>
       </w:r>
     </w:p>
     <w:p>
@@ -3744,6 +3819,49 @@
           <w:sz w:val="21"/>
           <w:szCs w:val="21"/>
         </w:rPr>
+        <w:t xml:space="preserve">Create and upload the tar archive </w:t>
+      </w:r>
+      <w:r>
+        <w:rPr>
+          <w:rFonts w:ascii="Segoe UI" w:hAnsi="Segoe UI" w:cs="Segoe UI"/>
+          <w:color w:val="1F2328"/>
+          <w:sz w:val="21"/>
+          <w:szCs w:val="21"/>
+        </w:rPr>
+        <w:t xml:space="preserve">, tar contents files </w:t>
+      </w:r>
+      <w:r>
+        <w:rPr>
+          <w:rFonts w:ascii="Segoe UI" w:hAnsi="Segoe UI" w:cs="Segoe UI"/>
+          <w:color w:val="1F2328"/>
+          <w:sz w:val="21"/>
+          <w:szCs w:val="21"/>
+        </w:rPr>
+        <w:t>as usual.</w:t>
+      </w:r>
+    </w:p>
+    <w:p>
+      <w:pPr>
+        <w:numPr>
+          <w:ilvl w:val="0"/>
+          <w:numId w:val="21"/>
+        </w:numPr>
+        <w:shd w:val="clear" w:color="auto" w:fill="FFFFFF"/>
+        <w:spacing w:before="60" w:after="100" w:afterAutospacing="1"/>
+        <w:rPr>
+          <w:rFonts w:ascii="Segoe UI" w:hAnsi="Segoe UI" w:cs="Segoe UI"/>
+          <w:color w:val="1F2328"/>
+          <w:sz w:val="21"/>
+          <w:szCs w:val="21"/>
+        </w:rPr>
+      </w:pPr>
+      <w:r>
+        <w:rPr>
+          <w:rFonts w:ascii="Segoe UI" w:hAnsi="Segoe UI" w:cs="Segoe UI"/>
+          <w:color w:val="1F2328"/>
+          <w:sz w:val="21"/>
+          <w:szCs w:val="21"/>
+        </w:rPr>
         <w:t>Retain the tar checksum only as object-integrity evidence for the uploaded tar.</w:t>
       </w:r>
     </w:p>
@@ -4110,6 +4228,7 @@
           <w:sz w:val="18"/>
           <w:szCs w:val="18"/>
         </w:rPr>
+        <w:lastRenderedPageBreak/>
         <w:t>getExcludedFiles()</w:t>
       </w:r>
     </w:p>
@@ -4144,7 +4263,6 @@
         <w:pStyle w:val="Heading4"/>
       </w:pPr>
       <w:r>
-        <w:lastRenderedPageBreak/>
         <w:t>Rationale</w:t>
       </w:r>
     </w:p>
@@ -4755,7 +4873,7 @@
           <w:noProof/>
           <w14:ligatures w14:val="standardContextual"/>
         </w:rPr>
-        <w:pict w14:anchorId="1A9586D5">
+        <w:pict w14:anchorId="624D8A0E">
           <v:rect id="_x0000_i1025" alt="" style="width:468pt;height:.05pt;mso-width-percent:0;mso-height-percent:0;mso-width-percent:0;mso-height-percent:0" o:hralign="center" o:hrstd="t" o:hr="t" fillcolor="#a0a0a0" stroked="f"/>
         </w:pict>
       </w:r>
@@ -5008,6 +5126,7 @@
           <w:sz w:val="21"/>
           <w:szCs w:val="21"/>
         </w:rPr>
+        <w:lastRenderedPageBreak/>
         <w:t>If available:</w:t>
       </w:r>
     </w:p>
@@ -5058,7 +5177,6 @@
           <w:sz w:val="21"/>
           <w:szCs w:val="21"/>
         </w:rPr>
-        <w:lastRenderedPageBreak/>
         <w:t>skip filesystem traversal.</w:t>
       </w:r>
     </w:p>
@@ -5819,6 +5937,7 @@
           <w:sz w:val="21"/>
           <w:szCs w:val="21"/>
         </w:rPr>
+        <w:lastRenderedPageBreak/>
         <w:t>writes byte size;</w:t>
       </w:r>
     </w:p>
@@ -5888,7 +6007,6 @@
           <w:sz w:val="21"/>
           <w:szCs w:val="21"/>
         </w:rPr>
-        <w:lastRenderedPageBreak/>
         <w:t>symlink target field is </w:t>
       </w:r>
       <w:r>
@@ -6927,6 +7045,7 @@
                 <w:sz w:val="21"/>
                 <w:szCs w:val="21"/>
               </w:rPr>
+              <w:lastRenderedPageBreak/>
               <w:t>TC-11</w:t>
             </w:r>
           </w:p>
@@ -7108,7 +7227,6 @@
                 <w:sz w:val="21"/>
                 <w:szCs w:val="21"/>
               </w:rPr>
-              <w:lastRenderedPageBreak/>
               <w:t>TC-12</w:t>
             </w:r>
           </w:p>
@@ -9495,6 +9613,92 @@
     </w:lvl>
   </w:abstractNum>
   <w:abstractNum w:abstractNumId="9" w15:restartNumberingAfterBreak="0">
+    <w:nsid w:val="1F0665EC"/>
+    <w:multiLevelType w:val="hybridMultilevel"/>
+    <w:tmpl w:val="C2F01C20"/>
+    <w:lvl w:ilvl="0" w:tplc="0409000F">
+      <w:start w:val="1"/>
+      <w:numFmt w:val="decimal"/>
+      <w:lvlText w:val="%1."/>
+      <w:lvlJc w:val="left"/>
+      <w:pPr>
+        <w:ind w:left="720" w:hanging="360"/>
+      </w:pPr>
+    </w:lvl>
+    <w:lvl w:ilvl="1" w:tplc="04090019" w:tentative="1">
+      <w:start w:val="1"/>
+      <w:numFmt w:val="lowerLetter"/>
+      <w:lvlText w:val="%2."/>
+      <w:lvlJc w:val="left"/>
+      <w:pPr>
+        <w:ind w:left="1440" w:hanging="360"/>
+      </w:pPr>
+    </w:lvl>
+    <w:lvl w:ilvl="2" w:tplc="0409001B" w:tentative="1">
+      <w:start w:val="1"/>
+      <w:numFmt w:val="lowerRoman"/>
+      <w:lvlText w:val="%3."/>
+      <w:lvlJc w:val="right"/>
+      <w:pPr>
+        <w:ind w:left="2160" w:hanging="180"/>
+      </w:pPr>
+    </w:lvl>
+    <w:lvl w:ilvl="3" w:tplc="0409000F" w:tentative="1">
+      <w:start w:val="1"/>
+      <w:numFmt w:val="decimal"/>
+      <w:lvlText w:val="%4."/>
+      <w:lvlJc w:val="left"/>
+      <w:pPr>
+        <w:ind w:left="2880" w:hanging="360"/>
+      </w:pPr>
+    </w:lvl>
+    <w:lvl w:ilvl="4" w:tplc="04090019" w:tentative="1">
+      <w:start w:val="1"/>
+      <w:numFmt w:val="lowerLetter"/>
+      <w:lvlText w:val="%5."/>
+      <w:lvlJc w:val="left"/>
+      <w:pPr>
+        <w:ind w:left="3600" w:hanging="360"/>
+      </w:pPr>
+    </w:lvl>
+    <w:lvl w:ilvl="5" w:tplc="0409001B" w:tentative="1">
+      <w:start w:val="1"/>
+      <w:numFmt w:val="lowerRoman"/>
+      <w:lvlText w:val="%6."/>
+      <w:lvlJc w:val="right"/>
+      <w:pPr>
+        <w:ind w:left="4320" w:hanging="180"/>
+      </w:pPr>
+    </w:lvl>
+    <w:lvl w:ilvl="6" w:tplc="0409000F" w:tentative="1">
+      <w:start w:val="1"/>
+      <w:numFmt w:val="decimal"/>
+      <w:lvlText w:val="%7."/>
+      <w:lvlJc w:val="left"/>
+      <w:pPr>
+        <w:ind w:left="5040" w:hanging="360"/>
+      </w:pPr>
+    </w:lvl>
+    <w:lvl w:ilvl="7" w:tplc="04090019" w:tentative="1">
+      <w:start w:val="1"/>
+      <w:numFmt w:val="lowerLetter"/>
+      <w:lvlText w:val="%8."/>
+      <w:lvlJc w:val="left"/>
+      <w:pPr>
+        <w:ind w:left="5760" w:hanging="360"/>
+      </w:pPr>
+    </w:lvl>
+    <w:lvl w:ilvl="8" w:tplc="0409001B" w:tentative="1">
+      <w:start w:val="1"/>
+      <w:numFmt w:val="lowerRoman"/>
+      <w:lvlText w:val="%9."/>
+      <w:lvlJc w:val="right"/>
+      <w:pPr>
+        <w:ind w:left="6480" w:hanging="180"/>
+      </w:pPr>
+    </w:lvl>
+  </w:abstractNum>
+  <w:abstractNum w:abstractNumId="10" w15:restartNumberingAfterBreak="0">
     <w:nsid w:val="21F909CC"/>
     <w:multiLevelType w:val="multilevel"/>
     <w:tmpl w:val="28640906"/>
@@ -9643,7 +9847,7 @@
       </w:rPr>
     </w:lvl>
   </w:abstractNum>
-  <w:abstractNum w:abstractNumId="10" w15:restartNumberingAfterBreak="0">
+  <w:abstractNum w:abstractNumId="11" w15:restartNumberingAfterBreak="0">
     <w:nsid w:val="3804253C"/>
     <w:multiLevelType w:val="multilevel"/>
     <w:tmpl w:val="37146D02"/>
@@ -9756,7 +9960,7 @@
       </w:pPr>
     </w:lvl>
   </w:abstractNum>
-  <w:abstractNum w:abstractNumId="11" w15:restartNumberingAfterBreak="0">
+  <w:abstractNum w:abstractNumId="12" w15:restartNumberingAfterBreak="0">
     <w:nsid w:val="39246998"/>
     <w:multiLevelType w:val="multilevel"/>
     <w:tmpl w:val="570851CC"/>
@@ -9905,7 +10109,7 @@
       </w:rPr>
     </w:lvl>
   </w:abstractNum>
-  <w:abstractNum w:abstractNumId="12" w15:restartNumberingAfterBreak="0">
+  <w:abstractNum w:abstractNumId="13" w15:restartNumberingAfterBreak="0">
     <w:nsid w:val="3E161717"/>
     <w:multiLevelType w:val="multilevel"/>
     <w:tmpl w:val="15FCE300"/>
@@ -10054,7 +10258,7 @@
       </w:rPr>
     </w:lvl>
   </w:abstractNum>
-  <w:abstractNum w:abstractNumId="13" w15:restartNumberingAfterBreak="0">
+  <w:abstractNum w:abstractNumId="14" w15:restartNumberingAfterBreak="0">
     <w:nsid w:val="4433200A"/>
     <w:multiLevelType w:val="multilevel"/>
     <w:tmpl w:val="AA867748"/>
@@ -10203,7 +10407,7 @@
       </w:rPr>
     </w:lvl>
   </w:abstractNum>
-  <w:abstractNum w:abstractNumId="14" w15:restartNumberingAfterBreak="0">
+  <w:abstractNum w:abstractNumId="15" w15:restartNumberingAfterBreak="0">
     <w:nsid w:val="44831DFB"/>
     <w:multiLevelType w:val="multilevel"/>
     <w:tmpl w:val="AD18F68C"/>
@@ -10352,7 +10556,7 @@
       </w:rPr>
     </w:lvl>
   </w:abstractNum>
-  <w:abstractNum w:abstractNumId="15" w15:restartNumberingAfterBreak="0">
+  <w:abstractNum w:abstractNumId="16" w15:restartNumberingAfterBreak="0">
     <w:nsid w:val="44A95960"/>
     <w:multiLevelType w:val="multilevel"/>
     <w:tmpl w:val="13E6C9AC"/>
@@ -10501,7 +10705,7 @@
       </w:rPr>
     </w:lvl>
   </w:abstractNum>
-  <w:abstractNum w:abstractNumId="16" w15:restartNumberingAfterBreak="0">
+  <w:abstractNum w:abstractNumId="17" w15:restartNumberingAfterBreak="0">
     <w:nsid w:val="4AAA19AA"/>
     <w:multiLevelType w:val="multilevel"/>
     <w:tmpl w:val="AF840CE6"/>
@@ -10650,7 +10854,7 @@
       </w:rPr>
     </w:lvl>
   </w:abstractNum>
-  <w:abstractNum w:abstractNumId="17" w15:restartNumberingAfterBreak="0">
+  <w:abstractNum w:abstractNumId="18" w15:restartNumberingAfterBreak="0">
     <w:nsid w:val="4E5258C1"/>
     <w:multiLevelType w:val="multilevel"/>
     <w:tmpl w:val="7CF66010"/>
@@ -10799,7 +11003,7 @@
       </w:rPr>
     </w:lvl>
   </w:abstractNum>
-  <w:abstractNum w:abstractNumId="18" w15:restartNumberingAfterBreak="0">
+  <w:abstractNum w:abstractNumId="19" w15:restartNumberingAfterBreak="0">
     <w:nsid w:val="4FCD1FD8"/>
     <w:multiLevelType w:val="multilevel"/>
     <w:tmpl w:val="91F045C6"/>
@@ -10912,7 +11116,7 @@
       </w:pPr>
     </w:lvl>
   </w:abstractNum>
-  <w:abstractNum w:abstractNumId="19" w15:restartNumberingAfterBreak="0">
+  <w:abstractNum w:abstractNumId="20" w15:restartNumberingAfterBreak="0">
     <w:nsid w:val="56AC4905"/>
     <w:multiLevelType w:val="multilevel"/>
     <w:tmpl w:val="ECD68C3C"/>
@@ -11061,7 +11265,7 @@
       </w:rPr>
     </w:lvl>
   </w:abstractNum>
-  <w:abstractNum w:abstractNumId="20" w15:restartNumberingAfterBreak="0">
+  <w:abstractNum w:abstractNumId="21" w15:restartNumberingAfterBreak="0">
     <w:nsid w:val="5A6B07D4"/>
     <w:multiLevelType w:val="multilevel"/>
     <w:tmpl w:val="DBB43EB4"/>
@@ -11210,7 +11414,7 @@
       </w:rPr>
     </w:lvl>
   </w:abstractNum>
-  <w:abstractNum w:abstractNumId="21" w15:restartNumberingAfterBreak="0">
+  <w:abstractNum w:abstractNumId="22" w15:restartNumberingAfterBreak="0">
     <w:nsid w:val="607702FF"/>
     <w:multiLevelType w:val="multilevel"/>
     <w:tmpl w:val="465C90B6"/>
@@ -11359,7 +11563,7 @@
       </w:rPr>
     </w:lvl>
   </w:abstractNum>
-  <w:abstractNum w:abstractNumId="22" w15:restartNumberingAfterBreak="0">
+  <w:abstractNum w:abstractNumId="23" w15:restartNumberingAfterBreak="0">
     <w:nsid w:val="61210C6D"/>
     <w:multiLevelType w:val="multilevel"/>
     <w:tmpl w:val="A5A2D14A"/>
@@ -11508,7 +11712,7 @@
       </w:rPr>
     </w:lvl>
   </w:abstractNum>
-  <w:abstractNum w:abstractNumId="23" w15:restartNumberingAfterBreak="0">
+  <w:abstractNum w:abstractNumId="24" w15:restartNumberingAfterBreak="0">
     <w:nsid w:val="650B1697"/>
     <w:multiLevelType w:val="multilevel"/>
     <w:tmpl w:val="A6D00838"/>
@@ -11657,7 +11861,7 @@
       </w:rPr>
     </w:lvl>
   </w:abstractNum>
-  <w:abstractNum w:abstractNumId="24" w15:restartNumberingAfterBreak="0">
+  <w:abstractNum w:abstractNumId="25" w15:restartNumberingAfterBreak="0">
     <w:nsid w:val="6C084E77"/>
     <w:multiLevelType w:val="multilevel"/>
     <w:tmpl w:val="BE5674AC"/>
@@ -11806,7 +12010,7 @@
       </w:rPr>
     </w:lvl>
   </w:abstractNum>
-  <w:abstractNum w:abstractNumId="25" w15:restartNumberingAfterBreak="0">
+  <w:abstractNum w:abstractNumId="26" w15:restartNumberingAfterBreak="0">
     <w:nsid w:val="74C86F4F"/>
     <w:multiLevelType w:val="multilevel"/>
     <w:tmpl w:val="CE24AF9A"/>
@@ -11955,7 +12159,7 @@
       </w:rPr>
     </w:lvl>
   </w:abstractNum>
-  <w:abstractNum w:abstractNumId="26" w15:restartNumberingAfterBreak="0">
+  <w:abstractNum w:abstractNumId="27" w15:restartNumberingAfterBreak="0">
     <w:nsid w:val="75811512"/>
     <w:multiLevelType w:val="multilevel"/>
     <w:tmpl w:val="FA9CB67E"/>
@@ -12104,7 +12308,7 @@
       </w:rPr>
     </w:lvl>
   </w:abstractNum>
-  <w:abstractNum w:abstractNumId="27" w15:restartNumberingAfterBreak="0">
+  <w:abstractNum w:abstractNumId="28" w15:restartNumberingAfterBreak="0">
     <w:nsid w:val="7594777E"/>
     <w:multiLevelType w:val="multilevel"/>
     <w:tmpl w:val="D1740988"/>
@@ -12217,7 +12421,7 @@
       </w:pPr>
     </w:lvl>
   </w:abstractNum>
-  <w:abstractNum w:abstractNumId="28" w15:restartNumberingAfterBreak="0">
+  <w:abstractNum w:abstractNumId="29" w15:restartNumberingAfterBreak="0">
     <w:nsid w:val="7953306B"/>
     <w:multiLevelType w:val="multilevel"/>
     <w:tmpl w:val="657E2064"/>
@@ -12366,7 +12570,7 @@
       </w:rPr>
     </w:lvl>
   </w:abstractNum>
-  <w:abstractNum w:abstractNumId="29" w15:restartNumberingAfterBreak="0">
+  <w:abstractNum w:abstractNumId="30" w15:restartNumberingAfterBreak="0">
     <w:nsid w:val="7ABF36DF"/>
     <w:multiLevelType w:val="multilevel"/>
     <w:tmpl w:val="CDDC050E"/>
@@ -12461,7 +12665,7 @@
       </w:pPr>
     </w:lvl>
   </w:abstractNum>
-  <w:abstractNum w:abstractNumId="30" w15:restartNumberingAfterBreak="0">
+  <w:abstractNum w:abstractNumId="31" w15:restartNumberingAfterBreak="0">
     <w:nsid w:val="7C8C4DC5"/>
     <w:multiLevelType w:val="multilevel"/>
     <w:tmpl w:val="7E587E5E"/>
@@ -12611,61 +12815,61 @@
     </w:lvl>
   </w:abstractNum>
   <w:num w:numId="1" w16cid:durableId="1395007836">
-    <w:abstractNumId w:val="29"/>
+    <w:abstractNumId w:val="30"/>
   </w:num>
   <w:num w:numId="2" w16cid:durableId="1635913397">
     <w:abstractNumId w:val="2"/>
   </w:num>
   <w:num w:numId="3" w16cid:durableId="936909851">
-    <w:abstractNumId w:val="19"/>
+    <w:abstractNumId w:val="20"/>
   </w:num>
   <w:num w:numId="4" w16cid:durableId="1121267725">
-    <w:abstractNumId w:val="26"/>
+    <w:abstractNumId w:val="27"/>
   </w:num>
   <w:num w:numId="5" w16cid:durableId="1288510938">
     <w:abstractNumId w:val="3"/>
   </w:num>
   <w:num w:numId="6" w16cid:durableId="1624072198">
-    <w:abstractNumId w:val="23"/>
+    <w:abstractNumId w:val="24"/>
   </w:num>
   <w:num w:numId="7" w16cid:durableId="98960066">
-    <w:abstractNumId w:val="18"/>
+    <w:abstractNumId w:val="19"/>
   </w:num>
   <w:num w:numId="8" w16cid:durableId="935476684">
-    <w:abstractNumId w:val="10"/>
+    <w:abstractNumId w:val="11"/>
   </w:num>
   <w:num w:numId="9" w16cid:durableId="423695245">
-    <w:abstractNumId w:val="25"/>
+    <w:abstractNumId w:val="26"/>
   </w:num>
   <w:num w:numId="10" w16cid:durableId="769550311">
-    <w:abstractNumId w:val="15"/>
+    <w:abstractNumId w:val="16"/>
   </w:num>
   <w:num w:numId="11" w16cid:durableId="1603607360">
-    <w:abstractNumId w:val="17"/>
+    <w:abstractNumId w:val="18"/>
   </w:num>
   <w:num w:numId="12" w16cid:durableId="1217860658">
     <w:abstractNumId w:val="6"/>
   </w:num>
   <w:num w:numId="13" w16cid:durableId="2108308670">
-    <w:abstractNumId w:val="27"/>
+    <w:abstractNumId w:val="28"/>
   </w:num>
   <w:num w:numId="14" w16cid:durableId="1410811620">
-    <w:abstractNumId w:val="13"/>
+    <w:abstractNumId w:val="14"/>
   </w:num>
   <w:num w:numId="15" w16cid:durableId="159467055">
-    <w:abstractNumId w:val="20"/>
+    <w:abstractNumId w:val="21"/>
   </w:num>
   <w:num w:numId="16" w16cid:durableId="205875204">
-    <w:abstractNumId w:val="16"/>
+    <w:abstractNumId w:val="17"/>
   </w:num>
   <w:num w:numId="17" w16cid:durableId="673147550">
-    <w:abstractNumId w:val="11"/>
+    <w:abstractNumId w:val="12"/>
   </w:num>
   <w:num w:numId="18" w16cid:durableId="676930301">
-    <w:abstractNumId w:val="24"/>
+    <w:abstractNumId w:val="25"/>
   </w:num>
   <w:num w:numId="19" w16cid:durableId="43216207">
-    <w:abstractNumId w:val="12"/>
+    <w:abstractNumId w:val="13"/>
   </w:num>
   <w:num w:numId="20" w16cid:durableId="1036127128">
     <w:abstractNumId w:val="0"/>
@@ -12674,19 +12878,19 @@
     <w:abstractNumId w:val="5"/>
   </w:num>
   <w:num w:numId="22" w16cid:durableId="1069810764">
-    <w:abstractNumId w:val="22"/>
+    <w:abstractNumId w:val="23"/>
   </w:num>
   <w:num w:numId="23" w16cid:durableId="1315063558">
     <w:abstractNumId w:val="8"/>
   </w:num>
   <w:num w:numId="24" w16cid:durableId="142310046">
-    <w:abstractNumId w:val="28"/>
+    <w:abstractNumId w:val="29"/>
   </w:num>
   <w:num w:numId="25" w16cid:durableId="2123567087">
-    <w:abstractNumId w:val="14"/>
+    <w:abstractNumId w:val="15"/>
   </w:num>
   <w:num w:numId="26" w16cid:durableId="663093384">
-    <w:abstractNumId w:val="30"/>
+    <w:abstractNumId w:val="31"/>
   </w:num>
   <w:num w:numId="27" w16cid:durableId="242036652">
     <w:abstractNumId w:val="7"/>
@@ -12698,9 +12902,12 @@
     <w:abstractNumId w:val="4"/>
   </w:num>
   <w:num w:numId="30" w16cid:durableId="87163894">
-    <w:abstractNumId w:val="21"/>
+    <w:abstractNumId w:val="22"/>
   </w:num>
   <w:num w:numId="31" w16cid:durableId="975379850">
+    <w:abstractNumId w:val="10"/>
+  </w:num>
+  <w:num w:numId="32" w16cid:durableId="1810245274">
     <w:abstractNumId w:val="9"/>
   </w:num>
   <w:numIdMacAtCleanup w:val="13"/>

</xml_diff>